<commit_message>
Initial CQVIP working prototype
</commit_message>
<xml_diff>
--- a/OQ_Protocol.docx
+++ b/OQ_Protocol.docx
@@ -838,7 +838,254 @@
         <w:pStyle w:val="Heading1"/>
       </w:pPr>
       <w:r>
-        <w:t>URS-101</w:t>
+        <w:t>URS-001</w:t>
+      </w:r>
+    </w:p>
+    <w:p>
+      <w:r>
+        <w:t>Requirement:</w:t>
+        <w:br/>
+        <w:t>The washer shall complete a validated cleaning cycle.</w:t>
+      </w:r>
+    </w:p>
+    <w:p>
+      <w:r>
+        <w:t>Objective:</w:t>
+        <w:br/>
+        <w:t>Verify the requirement is satisfied.</w:t>
+      </w:r>
+    </w:p>
+    <w:tbl>
+      <w:tblPr>
+        <w:tblStyle w:val="TableGrid"/>
+        <w:tblW w:type="auto" w:w="0"/>
+        <w:tblLook w:firstColumn="1" w:firstRow="1" w:lastColumn="0" w:lastRow="0" w:noHBand="0" w:noVBand="1" w:val="04A0"/>
+      </w:tblPr>
+      <w:tblGrid>
+        <w:gridCol w:w="1728"/>
+        <w:gridCol w:w="1728"/>
+        <w:gridCol w:w="1728"/>
+        <w:gridCol w:w="1728"/>
+        <w:gridCol w:w="1728"/>
+      </w:tblGrid>
+      <w:tr>
+        <w:tc>
+          <w:tcPr>
+            <w:tcW w:type="dxa" w:w="1728"/>
+          </w:tcPr>
+          <w:p>
+            <w:r>
+              <w:t>Step</w:t>
+            </w:r>
+          </w:p>
+        </w:tc>
+        <w:tc>
+          <w:tcPr>
+            <w:tcW w:type="dxa" w:w="1728"/>
+          </w:tcPr>
+          <w:p>
+            <w:r>
+              <w:t>Action</w:t>
+            </w:r>
+          </w:p>
+        </w:tc>
+        <w:tc>
+          <w:tcPr>
+            <w:tcW w:type="dxa" w:w="1728"/>
+          </w:tcPr>
+          <w:p>
+            <w:r>
+              <w:t>Expected Result</w:t>
+            </w:r>
+          </w:p>
+        </w:tc>
+        <w:tc>
+          <w:tcPr>
+            <w:tcW w:type="dxa" w:w="1728"/>
+          </w:tcPr>
+          <w:p>
+            <w:r>
+              <w:t>Actual Result</w:t>
+            </w:r>
+          </w:p>
+        </w:tc>
+        <w:tc>
+          <w:tcPr>
+            <w:tcW w:type="dxa" w:w="1728"/>
+          </w:tcPr>
+          <w:p>
+            <w:r>
+              <w:t>Pass / Fail</w:t>
+            </w:r>
+          </w:p>
+        </w:tc>
+      </w:tr>
+      <w:tr>
+        <w:tc>
+          <w:tcPr>
+            <w:tcW w:type="dxa" w:w="1728"/>
+          </w:tcPr>
+          <w:p>
+            <w:r>
+              <w:t>1</w:t>
+            </w:r>
+          </w:p>
+        </w:tc>
+        <w:tc>
+          <w:tcPr>
+            <w:tcW w:type="dxa" w:w="1728"/>
+          </w:tcPr>
+          <w:p>
+            <w:r>
+              <w:t>Execute functional test.</w:t>
+            </w:r>
+          </w:p>
+        </w:tc>
+        <w:tc>
+          <w:tcPr>
+            <w:tcW w:type="dxa" w:w="1728"/>
+          </w:tcPr>
+          <w:p>
+            <w:r>
+              <w:t>Result meets acceptance criteria.</w:t>
+            </w:r>
+          </w:p>
+        </w:tc>
+        <w:tc>
+          <w:tcPr>
+            <w:tcW w:type="dxa" w:w="1728"/>
+          </w:tcPr>
+          <w:p>
+            <w:r/>
+          </w:p>
+        </w:tc>
+        <w:tc>
+          <w:tcPr>
+            <w:tcW w:type="dxa" w:w="1728"/>
+          </w:tcPr>
+          <w:p>
+            <w:r/>
+          </w:p>
+        </w:tc>
+      </w:tr>
+      <w:tr>
+        <w:tc>
+          <w:tcPr>
+            <w:tcW w:type="dxa" w:w="1728"/>
+          </w:tcPr>
+          <w:p>
+            <w:r>
+              <w:t>2</w:t>
+            </w:r>
+          </w:p>
+        </w:tc>
+        <w:tc>
+          <w:tcPr>
+            <w:tcW w:type="dxa" w:w="1728"/>
+          </w:tcPr>
+          <w:p>
+            <w:r>
+              <w:t>Observe system behavior.</w:t>
+            </w:r>
+          </w:p>
+        </w:tc>
+        <w:tc>
+          <w:tcPr>
+            <w:tcW w:type="dxa" w:w="1728"/>
+          </w:tcPr>
+          <w:p>
+            <w:r>
+              <w:t>Result meets acceptance criteria.</w:t>
+            </w:r>
+          </w:p>
+        </w:tc>
+        <w:tc>
+          <w:tcPr>
+            <w:tcW w:type="dxa" w:w="1728"/>
+          </w:tcPr>
+          <w:p>
+            <w:r/>
+          </w:p>
+        </w:tc>
+        <w:tc>
+          <w:tcPr>
+            <w:tcW w:type="dxa" w:w="1728"/>
+          </w:tcPr>
+          <w:p>
+            <w:r/>
+          </w:p>
+        </w:tc>
+      </w:tr>
+      <w:tr>
+        <w:tc>
+          <w:tcPr>
+            <w:tcW w:type="dxa" w:w="1728"/>
+          </w:tcPr>
+          <w:p>
+            <w:r>
+              <w:t>3</w:t>
+            </w:r>
+          </w:p>
+        </w:tc>
+        <w:tc>
+          <w:tcPr>
+            <w:tcW w:type="dxa" w:w="1728"/>
+          </w:tcPr>
+          <w:p>
+            <w:r>
+              <w:t>Document results.</w:t>
+            </w:r>
+          </w:p>
+        </w:tc>
+        <w:tc>
+          <w:tcPr>
+            <w:tcW w:type="dxa" w:w="1728"/>
+          </w:tcPr>
+          <w:p>
+            <w:r>
+              <w:t>Result meets acceptance criteria.</w:t>
+            </w:r>
+          </w:p>
+        </w:tc>
+        <w:tc>
+          <w:tcPr>
+            <w:tcW w:type="dxa" w:w="1728"/>
+          </w:tcPr>
+          <w:p>
+            <w:r/>
+          </w:p>
+        </w:tc>
+        <w:tc>
+          <w:tcPr>
+            <w:tcW w:type="dxa" w:w="1728"/>
+          </w:tcPr>
+          <w:p>
+            <w:r/>
+          </w:p>
+        </w:tc>
+      </w:tr>
+    </w:tbl>
+    <w:p>
+      <w:r>
+        <w:t>Acceptance Criteria:</w:t>
+      </w:r>
+    </w:p>
+    <w:p>
+      <w:r>
+        <w:t>• Requirement successfully demonstrated.</w:t>
+      </w:r>
+    </w:p>
+    <w:p>
+      <w:r>
+        <w:t>Qualification Phase: OQ / PQ</w:t>
+      </w:r>
+    </w:p>
+    <w:p>
+      <w:pPr>
+        <w:pStyle w:val="Heading1"/>
+      </w:pPr>
+      <w:r>
+        <w:t>URS-002</w:t>
       </w:r>
     </w:p>
     <w:p>
@@ -1143,559 +1390,7 @@
         <w:pStyle w:val="Heading1"/>
       </w:pPr>
       <w:r>
-        <w:t>URS-002</w:t>
-      </w:r>
-    </w:p>
-    <w:p>
-      <w:r>
-        <w:t>Requirement:</w:t>
-        <w:br/>
-        <w:t>The washer shall complete a validated cleaning cycle.</w:t>
-      </w:r>
-    </w:p>
-    <w:p>
-      <w:r>
-        <w:t>Objective:</w:t>
-        <w:br/>
-        <w:t>Verify the requirement is satisfied.</w:t>
-      </w:r>
-    </w:p>
-    <w:tbl>
-      <w:tblPr>
-        <w:tblStyle w:val="TableGrid"/>
-        <w:tblW w:type="auto" w:w="0"/>
-        <w:tblLook w:firstColumn="1" w:firstRow="1" w:lastColumn="0" w:lastRow="0" w:noHBand="0" w:noVBand="1" w:val="04A0"/>
-      </w:tblPr>
-      <w:tblGrid>
-        <w:gridCol w:w="1728"/>
-        <w:gridCol w:w="1728"/>
-        <w:gridCol w:w="1728"/>
-        <w:gridCol w:w="1728"/>
-        <w:gridCol w:w="1728"/>
-      </w:tblGrid>
-      <w:tr>
-        <w:tc>
-          <w:tcPr>
-            <w:tcW w:type="dxa" w:w="1728"/>
-          </w:tcPr>
-          <w:p>
-            <w:r>
-              <w:t>Step</w:t>
-            </w:r>
-          </w:p>
-        </w:tc>
-        <w:tc>
-          <w:tcPr>
-            <w:tcW w:type="dxa" w:w="1728"/>
-          </w:tcPr>
-          <w:p>
-            <w:r>
-              <w:t>Action</w:t>
-            </w:r>
-          </w:p>
-        </w:tc>
-        <w:tc>
-          <w:tcPr>
-            <w:tcW w:type="dxa" w:w="1728"/>
-          </w:tcPr>
-          <w:p>
-            <w:r>
-              <w:t>Expected Result</w:t>
-            </w:r>
-          </w:p>
-        </w:tc>
-        <w:tc>
-          <w:tcPr>
-            <w:tcW w:type="dxa" w:w="1728"/>
-          </w:tcPr>
-          <w:p>
-            <w:r>
-              <w:t>Actual Result</w:t>
-            </w:r>
-          </w:p>
-        </w:tc>
-        <w:tc>
-          <w:tcPr>
-            <w:tcW w:type="dxa" w:w="1728"/>
-          </w:tcPr>
-          <w:p>
-            <w:r>
-              <w:t>Pass / Fail</w:t>
-            </w:r>
-          </w:p>
-        </w:tc>
-      </w:tr>
-      <w:tr>
-        <w:tc>
-          <w:tcPr>
-            <w:tcW w:type="dxa" w:w="1728"/>
-          </w:tcPr>
-          <w:p>
-            <w:r>
-              <w:t>1</w:t>
-            </w:r>
-          </w:p>
-        </w:tc>
-        <w:tc>
-          <w:tcPr>
-            <w:tcW w:type="dxa" w:w="1728"/>
-          </w:tcPr>
-          <w:p>
-            <w:r>
-              <w:t>Execute functional test.</w:t>
-            </w:r>
-          </w:p>
-        </w:tc>
-        <w:tc>
-          <w:tcPr>
-            <w:tcW w:type="dxa" w:w="1728"/>
-          </w:tcPr>
-          <w:p>
-            <w:r>
-              <w:t>Result meets acceptance criteria.</w:t>
-            </w:r>
-          </w:p>
-        </w:tc>
-        <w:tc>
-          <w:tcPr>
-            <w:tcW w:type="dxa" w:w="1728"/>
-          </w:tcPr>
-          <w:p>
-            <w:r/>
-          </w:p>
-        </w:tc>
-        <w:tc>
-          <w:tcPr>
-            <w:tcW w:type="dxa" w:w="1728"/>
-          </w:tcPr>
-          <w:p>
-            <w:r/>
-          </w:p>
-        </w:tc>
-      </w:tr>
-      <w:tr>
-        <w:tc>
-          <w:tcPr>
-            <w:tcW w:type="dxa" w:w="1728"/>
-          </w:tcPr>
-          <w:p>
-            <w:r>
-              <w:t>2</w:t>
-            </w:r>
-          </w:p>
-        </w:tc>
-        <w:tc>
-          <w:tcPr>
-            <w:tcW w:type="dxa" w:w="1728"/>
-          </w:tcPr>
-          <w:p>
-            <w:r>
-              <w:t>Observe system behavior.</w:t>
-            </w:r>
-          </w:p>
-        </w:tc>
-        <w:tc>
-          <w:tcPr>
-            <w:tcW w:type="dxa" w:w="1728"/>
-          </w:tcPr>
-          <w:p>
-            <w:r>
-              <w:t>Result meets acceptance criteria.</w:t>
-            </w:r>
-          </w:p>
-        </w:tc>
-        <w:tc>
-          <w:tcPr>
-            <w:tcW w:type="dxa" w:w="1728"/>
-          </w:tcPr>
-          <w:p>
-            <w:r/>
-          </w:p>
-        </w:tc>
-        <w:tc>
-          <w:tcPr>
-            <w:tcW w:type="dxa" w:w="1728"/>
-          </w:tcPr>
-          <w:p>
-            <w:r/>
-          </w:p>
-        </w:tc>
-      </w:tr>
-      <w:tr>
-        <w:tc>
-          <w:tcPr>
-            <w:tcW w:type="dxa" w:w="1728"/>
-          </w:tcPr>
-          <w:p>
-            <w:r>
-              <w:t>3</w:t>
-            </w:r>
-          </w:p>
-        </w:tc>
-        <w:tc>
-          <w:tcPr>
-            <w:tcW w:type="dxa" w:w="1728"/>
-          </w:tcPr>
-          <w:p>
-            <w:r>
-              <w:t>Document results.</w:t>
-            </w:r>
-          </w:p>
-        </w:tc>
-        <w:tc>
-          <w:tcPr>
-            <w:tcW w:type="dxa" w:w="1728"/>
-          </w:tcPr>
-          <w:p>
-            <w:r>
-              <w:t>Result meets acceptance criteria.</w:t>
-            </w:r>
-          </w:p>
-        </w:tc>
-        <w:tc>
-          <w:tcPr>
-            <w:tcW w:type="dxa" w:w="1728"/>
-          </w:tcPr>
-          <w:p>
-            <w:r/>
-          </w:p>
-        </w:tc>
-        <w:tc>
-          <w:tcPr>
-            <w:tcW w:type="dxa" w:w="1728"/>
-          </w:tcPr>
-          <w:p>
-            <w:r/>
-          </w:p>
-        </w:tc>
-      </w:tr>
-    </w:tbl>
-    <w:p>
-      <w:r>
-        <w:t>Acceptance Criteria:</w:t>
-      </w:r>
-    </w:p>
-    <w:p>
-      <w:r>
-        <w:t>• Requirement successfully demonstrated.</w:t>
-      </w:r>
-    </w:p>
-    <w:p>
-      <w:r>
-        <w:t>Qualification Phase: OQ / PQ</w:t>
-      </w:r>
-    </w:p>
-    <w:p>
-      <w:pPr>
-        <w:pStyle w:val="Heading1"/>
-      </w:pPr>
-      <w:r>
         <w:t>URS-003</w:t>
-      </w:r>
-    </w:p>
-    <w:p>
-      <w:r>
-        <w:t>Requirement:</w:t>
-        <w:br/>
-        <w:t>The washer shall alarm upon cycle failure.</w:t>
-      </w:r>
-    </w:p>
-    <w:p>
-      <w:r>
-        <w:t>Objective:</w:t>
-        <w:br/>
-        <w:t>Verify the alarm activates under the required condition.</w:t>
-      </w:r>
-    </w:p>
-    <w:tbl>
-      <w:tblPr>
-        <w:tblStyle w:val="TableGrid"/>
-        <w:tblW w:type="auto" w:w="0"/>
-        <w:tblLook w:firstColumn="1" w:firstRow="1" w:lastColumn="0" w:lastRow="0" w:noHBand="0" w:noVBand="1" w:val="04A0"/>
-      </w:tblPr>
-      <w:tblGrid>
-        <w:gridCol w:w="1728"/>
-        <w:gridCol w:w="1728"/>
-        <w:gridCol w:w="1728"/>
-        <w:gridCol w:w="1728"/>
-        <w:gridCol w:w="1728"/>
-      </w:tblGrid>
-      <w:tr>
-        <w:tc>
-          <w:tcPr>
-            <w:tcW w:type="dxa" w:w="1728"/>
-          </w:tcPr>
-          <w:p>
-            <w:r>
-              <w:t>Step</w:t>
-            </w:r>
-          </w:p>
-        </w:tc>
-        <w:tc>
-          <w:tcPr>
-            <w:tcW w:type="dxa" w:w="1728"/>
-          </w:tcPr>
-          <w:p>
-            <w:r>
-              <w:t>Action</w:t>
-            </w:r>
-          </w:p>
-        </w:tc>
-        <w:tc>
-          <w:tcPr>
-            <w:tcW w:type="dxa" w:w="1728"/>
-          </w:tcPr>
-          <w:p>
-            <w:r>
-              <w:t>Expected Result</w:t>
-            </w:r>
-          </w:p>
-        </w:tc>
-        <w:tc>
-          <w:tcPr>
-            <w:tcW w:type="dxa" w:w="1728"/>
-          </w:tcPr>
-          <w:p>
-            <w:r>
-              <w:t>Actual Result</w:t>
-            </w:r>
-          </w:p>
-        </w:tc>
-        <w:tc>
-          <w:tcPr>
-            <w:tcW w:type="dxa" w:w="1728"/>
-          </w:tcPr>
-          <w:p>
-            <w:r>
-              <w:t>Pass / Fail</w:t>
-            </w:r>
-          </w:p>
-        </w:tc>
-      </w:tr>
-      <w:tr>
-        <w:tc>
-          <w:tcPr>
-            <w:tcW w:type="dxa" w:w="1728"/>
-          </w:tcPr>
-          <w:p>
-            <w:r>
-              <w:t>1</w:t>
-            </w:r>
-          </w:p>
-        </w:tc>
-        <w:tc>
-          <w:tcPr>
-            <w:tcW w:type="dxa" w:w="1728"/>
-          </w:tcPr>
-          <w:p>
-            <w:r>
-              <w:t>Configure the system for normal operation.</w:t>
-            </w:r>
-          </w:p>
-        </w:tc>
-        <w:tc>
-          <w:tcPr>
-            <w:tcW w:type="dxa" w:w="1728"/>
-          </w:tcPr>
-          <w:p>
-            <w:r>
-              <w:t>Result meets acceptance criteria.</w:t>
-            </w:r>
-          </w:p>
-        </w:tc>
-        <w:tc>
-          <w:tcPr>
-            <w:tcW w:type="dxa" w:w="1728"/>
-          </w:tcPr>
-          <w:p>
-            <w:r/>
-          </w:p>
-        </w:tc>
-        <w:tc>
-          <w:tcPr>
-            <w:tcW w:type="dxa" w:w="1728"/>
-          </w:tcPr>
-          <w:p>
-            <w:r/>
-          </w:p>
-        </w:tc>
-      </w:tr>
-      <w:tr>
-        <w:tc>
-          <w:tcPr>
-            <w:tcW w:type="dxa" w:w="1728"/>
-          </w:tcPr>
-          <w:p>
-            <w:r>
-              <w:t>2</w:t>
-            </w:r>
-          </w:p>
-        </w:tc>
-        <w:tc>
-          <w:tcPr>
-            <w:tcW w:type="dxa" w:w="1728"/>
-          </w:tcPr>
-          <w:p>
-            <w:r>
-              <w:t>Create the specified alarm condition.</w:t>
-            </w:r>
-          </w:p>
-        </w:tc>
-        <w:tc>
-          <w:tcPr>
-            <w:tcW w:type="dxa" w:w="1728"/>
-          </w:tcPr>
-          <w:p>
-            <w:r>
-              <w:t>Result meets acceptance criteria.</w:t>
-            </w:r>
-          </w:p>
-        </w:tc>
-        <w:tc>
-          <w:tcPr>
-            <w:tcW w:type="dxa" w:w="1728"/>
-          </w:tcPr>
-          <w:p>
-            <w:r/>
-          </w:p>
-        </w:tc>
-        <w:tc>
-          <w:tcPr>
-            <w:tcW w:type="dxa" w:w="1728"/>
-          </w:tcPr>
-          <w:p>
-            <w:r/>
-          </w:p>
-        </w:tc>
-      </w:tr>
-      <w:tr>
-        <w:tc>
-          <w:tcPr>
-            <w:tcW w:type="dxa" w:w="1728"/>
-          </w:tcPr>
-          <w:p>
-            <w:r>
-              <w:t>3</w:t>
-            </w:r>
-          </w:p>
-        </w:tc>
-        <w:tc>
-          <w:tcPr>
-            <w:tcW w:type="dxa" w:w="1728"/>
-          </w:tcPr>
-          <w:p>
-            <w:r>
-              <w:t>Verify the alarm activates.</w:t>
-            </w:r>
-          </w:p>
-        </w:tc>
-        <w:tc>
-          <w:tcPr>
-            <w:tcW w:type="dxa" w:w="1728"/>
-          </w:tcPr>
-          <w:p>
-            <w:r>
-              <w:t>Result meets acceptance criteria.</w:t>
-            </w:r>
-          </w:p>
-        </w:tc>
-        <w:tc>
-          <w:tcPr>
-            <w:tcW w:type="dxa" w:w="1728"/>
-          </w:tcPr>
-          <w:p>
-            <w:r/>
-          </w:p>
-        </w:tc>
-        <w:tc>
-          <w:tcPr>
-            <w:tcW w:type="dxa" w:w="1728"/>
-          </w:tcPr>
-          <w:p>
-            <w:r/>
-          </w:p>
-        </w:tc>
-      </w:tr>
-      <w:tr>
-        <w:tc>
-          <w:tcPr>
-            <w:tcW w:type="dxa" w:w="1728"/>
-          </w:tcPr>
-          <w:p>
-            <w:r>
-              <w:t>4</w:t>
-            </w:r>
-          </w:p>
-        </w:tc>
-        <w:tc>
-          <w:tcPr>
-            <w:tcW w:type="dxa" w:w="1728"/>
-          </w:tcPr>
-          <w:p>
-            <w:r>
-              <w:t>Verify acknowledgement and recovery.</w:t>
-            </w:r>
-          </w:p>
-        </w:tc>
-        <w:tc>
-          <w:tcPr>
-            <w:tcW w:type="dxa" w:w="1728"/>
-          </w:tcPr>
-          <w:p>
-            <w:r>
-              <w:t>Result meets acceptance criteria.</w:t>
-            </w:r>
-          </w:p>
-        </w:tc>
-        <w:tc>
-          <w:tcPr>
-            <w:tcW w:type="dxa" w:w="1728"/>
-          </w:tcPr>
-          <w:p>
-            <w:r/>
-          </w:p>
-        </w:tc>
-        <w:tc>
-          <w:tcPr>
-            <w:tcW w:type="dxa" w:w="1728"/>
-          </w:tcPr>
-          <w:p>
-            <w:r/>
-          </w:p>
-        </w:tc>
-      </w:tr>
-    </w:tbl>
-    <w:p>
-      <w:r>
-        <w:t>Acceptance Criteria:</w:t>
-      </w:r>
-    </w:p>
-    <w:p>
-      <w:r>
-        <w:t>• Alarm activates correctly.</w:t>
-      </w:r>
-    </w:p>
-    <w:p>
-      <w:r>
-        <w:t>• Alarm is logged.</w:t>
-      </w:r>
-    </w:p>
-    <w:p>
-      <w:r>
-        <w:t>• System recovers after acknowledgement.</w:t>
-      </w:r>
-    </w:p>
-    <w:p>
-      <w:r>
-        <w:t>Qualification Phase: OQ</w:t>
-      </w:r>
-    </w:p>
-    <w:p>
-      <w:pPr>
-        <w:pStyle w:val="Heading1"/>
-      </w:pPr>
-      <w:r>
-        <w:t>URS-004</w:t>
       </w:r>
     </w:p>
     <w:p>
@@ -1942,7 +1637,7 @@
         <w:pStyle w:val="Heading1"/>
       </w:pPr>
       <w:r>
-        <w:t>URS-005</w:t>
+        <w:t>URS-004</w:t>
       </w:r>
     </w:p>
     <w:p>
@@ -2237,7 +1932,7 @@
         <w:pStyle w:val="Heading1"/>
       </w:pPr>
       <w:r>
-        <w:t>URS-006</w:t>
+        <w:t>URS-005</w:t>
       </w:r>
     </w:p>
     <w:p>
@@ -2484,7 +2179,7 @@
         <w:pStyle w:val="Heading1"/>
       </w:pPr>
       <w:r>
-        <w:t>URS-007</w:t>
+        <w:t>URS-006</w:t>
       </w:r>
     </w:p>
     <w:p>

</xml_diff>